<commit_message>
docs: actualizar manual de mensajeria
</commit_message>
<xml_diff>
--- a/docs/Manual_Mensajeria_Gestinem.docx
+++ b/docs/Manual_Mensajeria_Gestinem.docx
@@ -11,7 +11,7 @@
         <w:drawing>
           <wp:inline xmlns:a="http://schemas.openxmlformats.org/drawingml/2006/main" xmlns:pic="http://schemas.openxmlformats.org/drawingml/2006/picture">
             <wp:extent cx="3063240" cy="3063240"/>
-            <wp:docPr id="1" name="Picture 1" descr="Logotipo corporativo de Gestinem"/>
+            <wp:docPr id="1" name="Logotipo de Gestinem" descr="Logotipo de la aplicación Gestinem"/>
             <wp:cNvGraphicFramePr>
               <a:graphicFrameLocks noChangeAspect="1"/>
             </wp:cNvGraphicFramePr>
@@ -114,7 +114,7 @@
           <w:color w:val="183247"/>
           <w:sz w:val="21"/>
         </w:rPr>
-        <w:t>Las versiones para las tiendas de aplicaciones se publicarán próximamente. Mientras tanto, puede utilizar Gestinem desde Chrome, Edge, Safari o Brave en su móvil, tableta u ordenador. No necesita instalar ningún programa.</w:t>
+        <w:t>Puede utilizar Gestinem desde Chrome, Edge, Safari o Brave en su móvil, tableta u ordenador. No necesita instalar ningún programa. Las versiones para las tiendas de aplicaciones se publicarán próximamente.</w:t>
       </w:r>
     </w:p>
     <w:p>
@@ -144,7 +144,7 @@
           <w:color w:val="5D6B78"/>
           <w:sz w:val="20"/>
         </w:rPr>
-        <w:t>Comunicación segura, ordenada y vinculada a su empresa</w:t>
+        <w:t>Comunicación segura y vinculada a su empresa</w:t>
       </w:r>
     </w:p>
     <w:p>
@@ -213,7 +213,7 @@
           <w:color w:val="183247"/>
           <w:sz w:val="22"/>
         </w:rPr>
-        <w:t>Pulse Activar mi cuenta y abrir Gestinem. Se abrirá la aplicación en su navegador.</w:t>
+        <w:t>Pulse Activar mi cuenta y acceder a Gestinem. Se abrirá la aplicación en su navegador.</w:t>
       </w:r>
     </w:p>
     <w:p>
@@ -233,7 +233,7 @@
           <w:color w:val="183247"/>
           <w:sz w:val="22"/>
         </w:rPr>
-        <w:t>Cree una contraseña personal de al menos 10 caracteres.</w:t>
+        <w:t>Cree una contraseña de al menos 10 caracteres y escríbala de nuevo para confirmarla.</w:t>
       </w:r>
     </w:p>
     <w:p>
@@ -253,7 +253,7 @@
           <w:color w:val="183247"/>
           <w:sz w:val="22"/>
         </w:rPr>
-        <w:t>Entre con su correo y la nueva contraseña.</w:t>
+        <w:t>Pulse Activar y entrar. La cuenta quedará activada y accederá directamente a Gestinem.</w:t>
       </w:r>
     </w:p>
     <w:p>
@@ -265,7 +265,7 @@
         <w:drawing>
           <wp:inline xmlns:a="http://schemas.openxmlformats.org/drawingml/2006/main" xmlns:pic="http://schemas.openxmlformats.org/drawingml/2006/picture">
             <wp:extent cx="5806440" cy="3677412"/>
-            <wp:docPr id="2" name="Picture 2" descr="Acceso a Gestinem desde un navegador actualizado."/>
+            <wp:docPr id="2" name="Activación de la cuenta" descr="Pantalla para crear y confirmar la contraseña y activar la cuenta"/>
             <wp:cNvGraphicFramePr>
               <a:graphicFrameLocks noChangeAspect="1"/>
             </wp:cNvGraphicFramePr>
@@ -309,7 +309,7 @@
           <w:color w:val="5D6B78"/>
           <w:sz w:val="17"/>
         </w:rPr>
-        <w:t>Acceso a Gestinem desde un navegador actualizado.</w:t>
+        <w:t>Pantalla de activación incluida en el enlace de invitación.</w:t>
       </w:r>
     </w:p>
     <w:p>
@@ -337,7 +337,7 @@
           <w:color w:val="183247"/>
           <w:sz w:val="21"/>
         </w:rPr>
-        <w:t>Para volver a entrar, escriba https://app.gestinem.es en el navegador o guárdela en Favoritos. Cuando las versiones de tienda estén disponibles, Gestinem informará de su publicación.</w:t>
+        <w:t>Para volver a entrar, abra https://app.gestinem.es, escriba su correo y contraseña y pulse Entrar como cliente. Puede guardar la dirección en Favoritos.</w:t>
       </w:r>
     </w:p>
     <w:p>
@@ -356,7 +356,7 @@
     </w:p>
     <w:p>
       <w:r>
-        <w:t>Cada canal dirige su consulta al equipo correspondiente y mantiene juntos los mensajes y documentos relacionados.</w:t>
+        <w:t>La pantalla principal muestra dos canales. Seleccione uno en la parte superior antes de escribir.</w:t>
       </w:r>
     </w:p>
     <w:p>
@@ -368,7 +368,7 @@
         <w:drawing>
           <wp:inline xmlns:a="http://schemas.openxmlformats.org/drawingml/2006/main" xmlns:pic="http://schemas.openxmlformats.org/drawingml/2006/picture">
             <wp:extent cx="3749039" cy="4423866"/>
-            <wp:docPr id="3" name="Picture 3" descr="Canales disponibles en la aplicación Gestinem."/>
+            <wp:docPr id="3" name="Canales de mensajería" descr="Pantalla con los canales Canal general y Tu asesor, mensajes, adjuntos y notificaciones"/>
             <wp:cNvGraphicFramePr>
               <a:graphicFrameLocks noChangeAspect="1"/>
             </wp:cNvGraphicFramePr>
@@ -412,7 +412,7 @@
           <w:color w:val="5D6B78"/>
           <w:sz w:val="17"/>
         </w:rPr>
-        <w:t>Canales disponibles en la aplicación Gestinem.</w:t>
+        <w:t>Canales actuales de la aplicación Gestinem.</w:t>
       </w:r>
     </w:p>
     <w:p>
@@ -424,7 +424,7 @@
           <w:color w:val="0D2A6B"/>
           <w:sz w:val="22"/>
         </w:rPr>
-        <w:t xml:space="preserve">Laboral. </w:t>
+        <w:t xml:space="preserve">Canal general. </w:t>
       </w:r>
       <w:r>
         <w:rPr>
@@ -434,7 +434,7 @@
           <w:color w:val="183247"/>
           <w:sz w:val="22"/>
         </w:rPr>
-        <w:t>Nóminas, contratos, altas, bajas y Seguridad Social.</w:t>
+        <w:t>Para consultas fiscales, contables o laborales y para enviar documentación al personal autorizado del despacho.</w:t>
       </w:r>
     </w:p>
     <w:p>
@@ -446,7 +446,7 @@
           <w:color w:val="0D2A6B"/>
           <w:sz w:val="22"/>
         </w:rPr>
-        <w:t xml:space="preserve">Contable / Fiscal. </w:t>
+        <w:t xml:space="preserve">Tu asesor. </w:t>
       </w:r>
       <w:r>
         <w:rPr>
@@ -456,7 +456,7 @@
           <w:color w:val="183247"/>
           <w:sz w:val="22"/>
         </w:rPr>
-        <w:t>Facturas, impuestos, contabilidad y documentación económica.</w:t>
+        <w:t>Conversación privada con la persona responsable asignada a su empresa.</w:t>
       </w:r>
     </w:p>
     <w:p>
@@ -468,7 +468,7 @@
           <w:color w:val="0D2A6B"/>
           <w:sz w:val="22"/>
         </w:rPr>
-        <w:t xml:space="preserve">Directo. </w:t>
+        <w:t xml:space="preserve">Cómo elegir. </w:t>
       </w:r>
       <w:r>
         <w:rPr>
@@ -478,7 +478,7 @@
           <w:color w:val="183247"/>
           <w:sz w:val="22"/>
         </w:rPr>
-        <w:t>Conversación reservada con la persona responsable del despacho.</w:t>
+        <w:t>Use el Canal general para gestiones habituales y Tu asesor cuando el mensaje deba dirigirse personalmente a su responsable.</w:t>
       </w:r>
     </w:p>
     <w:p>
@@ -492,7 +492,7 @@
         <w:keepNext/>
       </w:pPr>
       <w:r>
-        <w:t>3. Envie mensajes y documentos</w:t>
+        <w:t>3. Envíe mensajes, documentos y notas de voz</w:t>
       </w:r>
     </w:p>
     <w:p>
@@ -512,7 +512,7 @@
           <w:color w:val="183247"/>
           <w:sz w:val="22"/>
         </w:rPr>
-        <w:t>Abra Laboral, Contable / Fiscal o Directo.</w:t>
+        <w:t>Abra Canal general o Tu asesor.</w:t>
       </w:r>
     </w:p>
     <w:p>
@@ -552,7 +552,7 @@
           <w:color w:val="183247"/>
           <w:sz w:val="22"/>
         </w:rPr>
-        <w:t>Para enviar archivos, pulse el icono de adjuntar y seleccione uno o varios documentos.</w:t>
+        <w:t>Para adjuntar un documento, pulse el icono del clip y seleccione un archivo.</w:t>
       </w:r>
     </w:p>
     <w:p>
@@ -572,7 +572,7 @@
           <w:color w:val="183247"/>
           <w:sz w:val="22"/>
         </w:rPr>
-        <w:t>Compruebe los nombres de los archivos y pulse Enviar una sola vez.</w:t>
+        <w:t>Para una nota de voz, pulse el micrófono. Revise el archivo o el mensaje y pulse Enviar una sola vez.</w:t>
       </w:r>
     </w:p>
     <w:p>
@@ -589,7 +589,7 @@
           <w:color w:val="0D2A6B"/>
           <w:sz w:val="22"/>
         </w:rPr>
-        <w:t>Formatos habituales</w:t>
+        <w:t>Formatos y tamaño</w:t>
         <w:br/>
       </w:r>
       <w:r>
@@ -600,7 +600,7 @@
           <w:color w:val="183247"/>
           <w:sz w:val="21"/>
         </w:rPr>
-        <w:t>Puede enviar PDF, imágenes, documentos de Word, hojas de cálculo, XML, CSV y ZIP. Utilice nombres claros, por ejemplo Factura_Luz_Agosto_2026.pdf.</w:t>
+        <w:t>Puede enviar archivos de hasta 50 MB: PDF, imágenes, documentos de Word, hojas de cálculo, TXT, XML, CSV y ZIP. Utilice nombres claros, por ejemplo Factura_Luz_Agosto_2026.pdf.</w:t>
       </w:r>
     </w:p>
     <w:p>
@@ -608,12 +608,12 @@
         <w:pStyle w:val="Heading2"/>
       </w:pPr>
       <w:r>
-        <w:t>Qué ocurre con los documentos</w:t>
+        <w:t>Documentos enviados y recibidos</w:t>
       </w:r>
     </w:p>
     <w:p>
       <w:r>
-        <w:t>Los archivos enviados quedan asociados a su conversación. Gestinem puede incorporarlos al expediente o a la gestión documental del despacho sin depender de teléfonos personales.</w:t>
+        <w:t>Los archivos quedan asociados a la conversación. Pulse un documento recibido para guardarlo o abrirlo. El despacho puede incorporarlo al expediente o a su gestión documental.</w:t>
       </w:r>
     </w:p>
     <w:p>
@@ -641,7 +641,7 @@
           <w:color w:val="183247"/>
           <w:sz w:val="21"/>
         </w:rPr>
-        <w:t>Si un archivo tarda unos segundos en aparecer, espere antes de volver a enviarlo.</w:t>
+        <w:t>Si un mensaje o archivo tarda unos segundos en aparecer, espere antes de volver a enviarlo.</w:t>
       </w:r>
     </w:p>
     <w:p>
@@ -654,7 +654,7 @@
     </w:p>
     <w:p>
       <w:r>
-        <w:t>Cuando Gestinem solicite permiso para mostrar notificaciones, pulse Permitir. Puede cambiar esta opción posteriormente desde los ajustes del navegador o del dispositivo.</w:t>
+        <w:t>En la franja inferior pulse Activar notificaciones y, cuando el navegador lo solicite, pulse Permitir. Si las bloquea, podrá habilitarlas desde el icono de candado situado junto a la dirección web.</w:t>
       </w:r>
     </w:p>
     <w:p>
@@ -728,7 +728,7 @@
           <w:color w:val="183247"/>
           <w:sz w:val="22"/>
         </w:rPr>
-        <w:t>Cierre la sesión si utiliza un ordenador compartido.</w:t>
+        <w:t>Cierre la sesión desde el menú si utiliza un ordenador compartido.</w:t>
       </w:r>
     </w:p>
     <w:p>
@@ -756,12 +756,31 @@
         <w:pStyle w:val="Heading2"/>
       </w:pPr>
       <w:r>
+        <w:t>Más opciones en el menú</w:t>
+      </w:r>
+    </w:p>
+    <w:p>
+      <w:pPr/>
+      <w:r>
+        <w:rPr>
+          <w:rFonts w:ascii="Aptos" w:hAnsi="Aptos"/>
+          <w:color w:val="183247"/>
+          <w:sz w:val="22"/>
+        </w:rPr>
+        <w:t>Abra el menú de la esquina superior izquierda para ir a Documentación, Mi área o Cerrar sesión. Según los servicios que el despacho haya habilitado para su empresa, también podrá consultar documentos, solicitar certificados o utilizar Facturación.</w:t>
+      </w:r>
+    </w:p>
+    <w:p>
+      <w:pPr>
+        <w:pStyle w:val="Heading2"/>
+      </w:pPr>
+      <w:r>
         <w:t>Si ha olvidado la contraseña</w:t>
       </w:r>
     </w:p>
     <w:p>
       <w:r>
-        <w:t>Pulse ¿Has olvidado tu contraseña? en la pantalla de acceso. Recibirá un enlace seguro para crear una nueva; el enlace caduca en una hora.</w:t>
+        <w:t>Pulse ¿Olvidaste tu contraseña? en la pantalla de acceso. Recibirá un enlace seguro para crear una nueva; el enlace caduca en una hora.</w:t>
       </w:r>
     </w:p>
     <w:p>
@@ -789,7 +808,7 @@
           <w:color w:val="183247"/>
           <w:sz w:val="21"/>
         </w:rPr>
-        <w:t>Si no recibe la invitación, revise la carpeta de correo no deseado. Para problemas de acceso o consultas urgentes, contacte con Gestinem por los medios habituales.</w:t>
+        <w:t>Si no recibe la invitación, revise la carpeta de correo no deseado. Si el enlace ha caducado, solicite a Gestinem que reenvíe la invitación. Para problemas de acceso o consultas urgentes, contacte con el despacho por los medios habituales.</w:t>
       </w:r>
     </w:p>
     <w:p>

</xml_diff>

<commit_message>
Sincronizar logotipos y mejorar mensajeria Flutter
</commit_message>
<xml_diff>
--- a/docs/Manual_Mensajeria_Gestinem.docx
+++ b/docs/Manual_Mensajeria_Gestinem.docx
@@ -54,7 +54,7 @@
           <w:color w:val="0759AF"/>
           <w:sz w:val="20"/>
         </w:rPr>
-        <w:t>NUEVA APLICACIÓN PARA CLIENTES</w:t>
+        <w:t>APLICACIÓN GESTINEM</w:t>
       </w:r>
     </w:p>
     <w:p>
@@ -86,7 +86,7 @@
           <w:color w:val="5D6B78"/>
           <w:sz w:val="32"/>
         </w:rPr>
-        <w:t>Guía rápida de acceso y mensajería</w:t>
+        <w:t>Guía rápida de acceso y mensajería para clientes y personal</w:t>
       </w:r>
     </w:p>
     <w:p>
@@ -649,12 +649,42 @@
         <w:pStyle w:val="Heading2"/>
       </w:pPr>
       <w:r>
+        <w:rPr/>
+        <w:t>Enviar con Intro (opcional)</w:t>
+      </w:r>
+    </w:p>
+    <w:p>
+      <w:r>
+        <w:rPr/>
+        <w:t>En Perfil o Mi área puede activar Enviar con Intro. Con esta opción, Intro envía el mensaje y Mayús+Intro crea una línea nueva. Si la deja desactivada, Intro seguirá creando líneas nuevas y podrá enviar con el botón correspondiente.</w:t>
+      </w:r>
+    </w:p>
+    <w:p>
+      <w:pPr>
+        <w:pStyle w:val="Heading2"/>
+      </w:pPr>
+      <w:r>
         <w:t>Recibir avisos</w:t>
       </w:r>
     </w:p>
     <w:p>
       <w:r>
         <w:t>En la franja inferior pulse Activar notificaciones y, cuando el navegador lo solicite, pulse Permitir. Si las bloquea, podrá habilitarlas desde el icono de candado situado junto a la dirección web.</w:t>
+      </w:r>
+    </w:p>
+    <w:p>
+      <w:pPr>
+        <w:pStyle w:val="Heading2"/>
+      </w:pPr>
+      <w:r>
+        <w:rPr/>
+        <w:t>Confirmación de cambios solicitados</w:t>
+      </w:r>
+    </w:p>
+    <w:p>
+      <w:r>
+        <w:rPr/>
+        <w:t>Cuando el despacho apruebe o rechace una solicitud para modificar los datos o el logotipo de su empresa, recibirá un mensaje de confirmación en Tu asesor. Si las notificaciones están activadas, también verá un aviso en su dispositivo.</w:t>
       </w:r>
     </w:p>
     <w:p>
@@ -668,7 +698,38 @@
         <w:keepNext/>
       </w:pPr>
       <w:r>
-        <w:t>4. Seguridad y ayuda</w:t>
+        <w:rPr/>
+        <w:t>4. Opciones del personal del despacho</w:t>
+      </w:r>
+    </w:p>
+    <w:p>
+      <w:r>
+        <w:rPr/>
+        <w:t>Esta sección se aplica al personal autorizado. Los administradores pueden abrir Gestionar grupos internos desde el menú para crear grupos, cambiar sus miembros y consultar los grupos históricos.</w:t>
+      </w:r>
+    </w:p>
+    <w:p>
+      <w:pPr>
+        <w:pStyle w:val="Heading2"/>
+      </w:pPr>
+      <w:r>
+        <w:rPr/>
+        <w:t>Avatar de los grupos</w:t>
+      </w:r>
+    </w:p>
+    <w:p>
+      <w:r>
+        <w:rPr/>
+        <w:t>Abra el menú de acciones de un grupo y elija Añadir avatar o Cambiar avatar. Puede seleccionar una imagen JPG, PNG o WEBP; Gestinem la adapta automáticamente para mostrarla en la lista y en la cabecera del chat. Use Eliminar avatar para volver a las iniciales del grupo.</w:t>
+      </w:r>
+    </w:p>
+    <w:p>
+      <w:pPr>
+        <w:pStyle w:val="Heading1"/>
+        <w:keepNext/>
+      </w:pPr>
+      <w:r>
+        <w:t>5. Seguridad y ayuda</w:t>
       </w:r>
     </w:p>
     <w:p>
@@ -767,7 +828,7 @@
           <w:color w:val="183247"/>
           <w:sz w:val="22"/>
         </w:rPr>
-        <w:t>Abra el menú de la esquina superior izquierda para ir a Documentación, Mi área o Cerrar sesión. Según los servicios que el despacho haya habilitado para su empresa, también podrá consultar documentos, solicitar certificados o utilizar Facturación.</w:t>
+        <w:t>Abra el menú de la esquina superior izquierda. Desde él puede volver a Conversaciones, abrir el Manual de Gestinem, acceder a su Perfil o Mi área y cerrar la sesión. Según los servicios habilitados para su empresa, también podrá consultar documentación, solicitar certificados o utilizar Facturación.</w:t>
       </w:r>
     </w:p>
     <w:p>
@@ -853,7 +914,7 @@
         <w:color w:val="5D6B78"/>
         <w:sz w:val="17"/>
       </w:rPr>
-      <w:t xml:space="preserve">Gestinem · Guía para clientes · </w:t>
+      <w:t xml:space="preserve">Gestinem · Guía para clientes y personal · </w:t>
     </w:r>
     <w:r>
       <w:rPr>

</xml_diff>